<commit_message>
chore: regenerate CV (PDF/DOCX) with SOFIA/AI narrative and normalized titles
</commit_message>
<xml_diff>
--- a/public/carlos-monti-cv.docx
+++ b/public/carlos-monti-cv.docx
@@ -90,22 +90,17 @@
       </w:pPr>
       <w:r>
         <w:rPr>
-          <w:rFonts w:ascii="Arial" w:cs="Arial" w:eastAsia="Arial" w:hAnsi="Arial"/>
-          <w:b w:val="0"/>
-          <w:bCs w:val="0"/>
-          <w:i w:val="0"/>
-          <w:iCs w:val="0"/>
-          <w:smallCaps w:val="0"/>
-          <w:strike w:val="0"/>
           <w:color w:val="444444"/>
           <w:sz w:val="26"/>
           <w:szCs w:val="26"/>
-          <w:u w:val="none"/>
-          <w:shd w:fill="auto" w:val="clear"/>
-          <w:vertAlign w:val="baseline"/>
-          <w:rtl w:val="0"/>
-        </w:rPr>
-        <w:t xml:space="preserve">Senior Frontend Engineer  •  React  •  TypeScript  •  Remote</w:t>
+          <w:rtl w:val="0"/>
+        </w:rPr>
+        <w:t xml:space="preserve">Senior Software Engineer  •  AI Products &amp; Agentic Tooling  •  Remote</w:t>
+      </w:r>
+      <w:r>
+        <w:rPr>
+          <w:rtl w:val="0"/>
+        </w:rPr>
       </w:r>
     </w:p>
     <w:p>
@@ -315,22 +310,17 @@
       </w:pPr>
       <w:r>
         <w:rPr>
-          <w:rFonts w:ascii="Arial" w:cs="Arial" w:eastAsia="Arial" w:hAnsi="Arial"/>
-          <w:b w:val="0"/>
-          <w:bCs w:val="0"/>
-          <w:i w:val="0"/>
-          <w:iCs w:val="0"/>
-          <w:smallCaps w:val="0"/>
-          <w:strike w:val="0"/>
           <w:color w:val="333333"/>
           <w:sz w:val="26"/>
           <w:szCs w:val="26"/>
-          <w:u w:val="none"/>
-          <w:shd w:fill="auto" w:val="clear"/>
-          <w:vertAlign w:val="baseline"/>
-          <w:rtl w:val="0"/>
-        </w:rPr>
-        <w:t xml:space="preserve">Frontend Engineer with 14+ years building performant web apps for fintech, travel, and logistics. Expert in React, TypeScript, and scalable architectures (monorepos, Module Federation, BFF patterns). Track record of reducing build times 40%, cutting bugs 30%, and shipping features for platforms serving millions.</w:t>
+          <w:rtl w:val="0"/>
+        </w:rPr>
+        <w:t xml:space="preserve">Senior Software Engineer with ~19 years shipping web products for travel, fintech, and logistics. Currently building SOFIA, the AI travel assistant at Despegar (a Prosus company). I build with AI daily: my own Claude Code skills and agents let me ship full products solo. Track record: build times -40%, bugs -30%, code duplication -50%.</w:t>
+      </w:r>
+      <w:r>
+        <w:rPr>
+          <w:rtl w:val="0"/>
+        </w:rPr>
       </w:r>
     </w:p>
     <w:p>
@@ -421,22 +411,19 @@
       </w:pPr>
       <w:r>
         <w:rPr>
-          <w:rFonts w:ascii="Arial" w:cs="Arial" w:eastAsia="Arial" w:hAnsi="Arial"/>
-          <w:b w:val="1"/>
-          <w:bCs w:val="1"/>
-          <w:i w:val="0"/>
-          <w:iCs w:val="0"/>
-          <w:smallCaps w:val="0"/>
-          <w:strike w:val="0"/>
+          <w:b w:val="1"/>
+          <w:bCs w:val="1"/>
           <w:color w:val="1a1a1a"/>
           <w:sz w:val="27"/>
           <w:szCs w:val="27"/>
-          <w:u w:val="none"/>
-          <w:shd w:fill="auto" w:val="clear"/>
-          <w:vertAlign w:val="baseline"/>
-          <w:rtl w:val="0"/>
-        </w:rPr>
-        <w:t xml:space="preserve">Senior Frontend Engineer – Despegar.com</w:t>
+          <w:rtl w:val="0"/>
+        </w:rPr>
+        <w:t xml:space="preserve">Senior Software Engineer III – Despegar.com (Prosus)</w:t>
+      </w:r>
+      <w:r>
+        <w:rPr>
+          <w:rtl w:val="0"/>
+        </w:rPr>
       </w:r>
     </w:p>
     <w:p>
@@ -474,22 +461,33 @@
       </w:pPr>
       <w:r>
         <w:rPr>
-          <w:rFonts w:ascii="Arial" w:cs="Arial" w:eastAsia="Arial" w:hAnsi="Arial"/>
-          <w:b w:val="0"/>
-          <w:bCs w:val="0"/>
           <w:i w:val="1"/>
           <w:iCs w:val="1"/>
-          <w:smallCaps w:val="0"/>
-          <w:strike w:val="0"/>
           <w:color w:val="666666"/>
           <w:sz w:val="24"/>
           <w:szCs w:val="24"/>
-          <w:u w:val="none"/>
-          <w:shd w:fill="auto" w:val="clear"/>
-          <w:vertAlign w:val="baseline"/>
-          <w:rtl w:val="0"/>
-        </w:rPr>
-        <w:t xml:space="preserve">Jul 2023 – Present  •  Buenos Aires</w:t>
+          <w:rtl w:val="0"/>
+        </w:rPr>
+        <w:t xml:space="preserve">Jul 2026 – Present</w:t>
+      </w:r>
+      <w:r>
+        <w:rPr>
+          <w:rFonts w:ascii="Arial" w:cs="Arial" w:eastAsia="Arial" w:hAnsi="Arial"/>
+          <w:b w:val="0"/>
+          <w:bCs w:val="0"/>
+          <w:i w:val="1"/>
+          <w:iCs w:val="1"/>
+          <w:smallCaps w:val="0"/>
+          <w:strike w:val="0"/>
+          <w:color w:val="666666"/>
+          <w:sz w:val="24"/>
+          <w:szCs w:val="24"/>
+          <w:u w:val="none"/>
+          <w:shd w:fill="auto" w:val="clear"/>
+          <w:vertAlign w:val="baseline"/>
+          <w:rtl w:val="0"/>
+        </w:rPr>
+        <w:t xml:space="preserve">  •  Buenos Aires</w:t>
       </w:r>
     </w:p>
     <w:p>
@@ -520,22 +518,86 @@
       </w:pPr>
       <w:r>
         <w:rPr>
-          <w:rFonts w:ascii="Arial" w:cs="Arial" w:eastAsia="Arial" w:hAnsi="Arial"/>
-          <w:b w:val="0"/>
-          <w:bCs w:val="0"/>
-          <w:i w:val="0"/>
-          <w:iCs w:val="0"/>
-          <w:smallCaps w:val="0"/>
-          <w:strike w:val="0"/>
-          <w:color w:val="333333"/>
-          <w:sz w:val="25"/>
-          <w:szCs w:val="25"/>
-          <w:u w:val="none"/>
-          <w:shd w:fill="auto" w:val="clear"/>
-          <w:vertAlign w:val="baseline"/>
-          <w:rtl w:val="0"/>
-        </w:rPr>
-        <w:t xml:space="preserve">Cut build times 40% through Nx monorepo refactoring across multiple post-sales apps</w:t>
+          <w:color w:val="333333"/>
+          <w:sz w:val="25"/>
+          <w:szCs w:val="25"/>
+          <w:rtl w:val="0"/>
+        </w:rPr>
+        <w:t xml:space="preserve">Building SOFIA, Despegar's AI travel assistant: conversational UX and LLM features</w:t>
+      </w:r>
+    </w:p>
+    <w:p>
+      <w:pPr>
+        <w:keepNext w:val="0"/>
+        <w:keepLines w:val="0"/>
+        <w:pageBreakBefore w:val="0"/>
+        <w:widowControl w:val="1"/>
+        <w:pBdr>
+          <w:top w:space="0" w:sz="0" w:val="nil"/>
+          <w:left w:space="0" w:sz="0" w:val="nil"/>
+          <w:bottom w:space="0" w:sz="0" w:val="nil"/>
+          <w:right w:space="0" w:sz="0" w:val="nil"/>
+          <w:between w:space="0" w:sz="0" w:val="nil"/>
+        </w:pBdr>
+        <w:shd w:fill="auto" w:val="clear"/>
+        <w:spacing w:after="10" w:before="100" w:line="240" w:lineRule="auto"/>
+        <w:ind w:left="0" w:right="0" w:firstLine="0"/>
+        <w:jc w:val="left"/>
+        <w:rPr>
+          <w:b w:val="1"/>
+          <w:bCs w:val="1"/>
+          <w:color w:val="1a1a1a"/>
+          <w:sz w:val="27"/>
+          <w:szCs w:val="27"/>
+        </w:rPr>
+      </w:pPr>
+      <w:r>
+        <w:rPr>
+          <w:b w:val="1"/>
+          <w:bCs w:val="1"/>
+          <w:color w:val="1a1a1a"/>
+          <w:sz w:val="27"/>
+          <w:szCs w:val="27"/>
+          <w:rtl w:val="0"/>
+        </w:rPr>
+        <w:t xml:space="preserve">Senior Software Engineer II – Despegar.com</w:t>
+      </w:r>
+    </w:p>
+    <w:p>
+      <w:pPr>
+        <w:keepNext w:val="0"/>
+        <w:keepLines w:val="0"/>
+        <w:pageBreakBefore w:val="0"/>
+        <w:widowControl w:val="1"/>
+        <w:pBdr>
+          <w:top w:space="0" w:sz="0" w:val="nil"/>
+          <w:left w:space="0" w:sz="0" w:val="nil"/>
+          <w:bottom w:space="0" w:sz="0" w:val="nil"/>
+          <w:right w:space="0" w:sz="0" w:val="nil"/>
+          <w:between w:space="0" w:sz="0" w:val="nil"/>
+        </w:pBdr>
+        <w:shd w:fill="auto" w:val="clear"/>
+        <w:spacing w:after="40" w:before="0" w:line="240" w:lineRule="auto"/>
+        <w:ind w:left="0" w:right="0" w:firstLine="0"/>
+        <w:jc w:val="left"/>
+        <w:rPr>
+          <w:i w:val="1"/>
+          <w:iCs w:val="1"/>
+          <w:color w:val="666666"/>
+          <w:sz w:val="24"/>
+          <w:szCs w:val="24"/>
+        </w:rPr>
+      </w:pPr>
+      <w:r>
+        <w:rPr>
+          <w:i w:val="1"/>
+          <w:iCs w:val="1"/>
+          <w:color w:val="666666"/>
+          <w:sz w:val="24"/>
+          <w:szCs w:val="24"/>
+          <w:rtl w:val="0"/>
+        </w:rPr>
+        <w:t xml:space="preserve">Jul 2023 – Jun 2026  •  Buenos Aires</w:t>
       </w:r>
     </w:p>
     <w:p>
@@ -581,113 +643,7 @@
           <w:vertAlign w:val="baseline"/>
           <w:rtl w:val="0"/>
         </w:rPr>
-        <w:t xml:space="preserve">Ship features impacting 10k+ daily users; improved delivery predictability 25% via Product/UX collaboration</w:t>
-      </w:r>
-    </w:p>
-    <w:p>
-      <w:pPr>
-        <w:keepNext w:val="0"/>
-        <w:keepLines w:val="0"/>
-        <w:pageBreakBefore w:val="0"/>
-        <w:widowControl w:val="1"/>
-        <w:pBdr>
-          <w:top w:space="0" w:sz="0" w:val="nil"/>
-          <w:left w:space="0" w:sz="0" w:val="nil"/>
-          <w:bottom w:space="0" w:sz="0" w:val="nil"/>
-          <w:right w:space="0" w:sz="0" w:val="nil"/>
-          <w:between w:space="0" w:sz="0" w:val="nil"/>
-        </w:pBdr>
-        <w:shd w:fill="auto" w:val="clear"/>
-        <w:spacing w:after="10" w:before="100" w:line="240" w:lineRule="auto"/>
-        <w:ind w:left="0" w:right="0" w:firstLine="0"/>
-        <w:jc w:val="left"/>
-        <w:rPr>
-          <w:rFonts w:ascii="Arial" w:cs="Arial" w:eastAsia="Arial" w:hAnsi="Arial"/>
-          <w:b w:val="1"/>
-          <w:bCs w:val="1"/>
-          <w:i w:val="0"/>
-          <w:iCs w:val="0"/>
-          <w:smallCaps w:val="0"/>
-          <w:strike w:val="0"/>
-          <w:color w:val="1a1a1a"/>
-          <w:sz w:val="27"/>
-          <w:szCs w:val="27"/>
-          <w:u w:val="none"/>
-          <w:shd w:fill="auto" w:val="clear"/>
-          <w:vertAlign w:val="baseline"/>
-        </w:rPr>
-      </w:pPr>
-      <w:r>
-        <w:rPr>
-          <w:rFonts w:ascii="Arial" w:cs="Arial" w:eastAsia="Arial" w:hAnsi="Arial"/>
-          <w:b w:val="1"/>
-          <w:bCs w:val="1"/>
-          <w:i w:val="0"/>
-          <w:iCs w:val="0"/>
-          <w:smallCaps w:val="0"/>
-          <w:strike w:val="0"/>
-          <w:color w:val="1a1a1a"/>
-          <w:sz w:val="27"/>
-          <w:szCs w:val="27"/>
-          <w:u w:val="none"/>
-          <w:shd w:fill="auto" w:val="clear"/>
-          <w:vertAlign w:val="baseline"/>
-          <w:rtl w:val="0"/>
-        </w:rPr>
-        <w:t xml:space="preserve">Senior Frontend Engineer – Brubank</w:t>
-      </w:r>
-    </w:p>
-    <w:p>
-      <w:pPr>
-        <w:keepNext w:val="0"/>
-        <w:keepLines w:val="0"/>
-        <w:pageBreakBefore w:val="0"/>
-        <w:widowControl w:val="1"/>
-        <w:pBdr>
-          <w:top w:space="0" w:sz="0" w:val="nil"/>
-          <w:left w:space="0" w:sz="0" w:val="nil"/>
-          <w:bottom w:space="0" w:sz="0" w:val="nil"/>
-          <w:right w:space="0" w:sz="0" w:val="nil"/>
-          <w:between w:space="0" w:sz="0" w:val="nil"/>
-        </w:pBdr>
-        <w:shd w:fill="auto" w:val="clear"/>
-        <w:spacing w:after="40" w:before="0" w:line="240" w:lineRule="auto"/>
-        <w:ind w:left="0" w:right="0" w:firstLine="0"/>
-        <w:jc w:val="left"/>
-        <w:rPr>
-          <w:rFonts w:ascii="Arial" w:cs="Arial" w:eastAsia="Arial" w:hAnsi="Arial"/>
-          <w:b w:val="0"/>
-          <w:bCs w:val="0"/>
-          <w:i w:val="1"/>
-          <w:iCs w:val="1"/>
-          <w:smallCaps w:val="0"/>
-          <w:strike w:val="0"/>
-          <w:color w:val="666666"/>
-          <w:sz w:val="24"/>
-          <w:szCs w:val="24"/>
-          <w:u w:val="none"/>
-          <w:shd w:fill="auto" w:val="clear"/>
-          <w:vertAlign w:val="baseline"/>
-        </w:rPr>
-      </w:pPr>
-      <w:r>
-        <w:rPr>
-          <w:rFonts w:ascii="Arial" w:cs="Arial" w:eastAsia="Arial" w:hAnsi="Arial"/>
-          <w:b w:val="0"/>
-          <w:bCs w:val="0"/>
-          <w:i w:val="1"/>
-          <w:iCs w:val="1"/>
-          <w:smallCaps w:val="0"/>
-          <w:strike w:val="0"/>
-          <w:color w:val="666666"/>
-          <w:sz w:val="24"/>
-          <w:szCs w:val="24"/>
-          <w:u w:val="none"/>
-          <w:shd w:fill="auto" w:val="clear"/>
-          <w:vertAlign w:val="baseline"/>
-          <w:rtl w:val="0"/>
-        </w:rPr>
-        <w:t xml:space="preserve">Aug 2022 – May 2023  •  Buenos Aires</w:t>
+        <w:t xml:space="preserve">Cut build times 40% through Nx monorepo refactoring across multiple post-sales apps</w:t>
       </w:r>
     </w:p>
     <w:p>
@@ -718,22 +674,128 @@
       </w:pPr>
       <w:r>
         <w:rPr>
-          <w:rFonts w:ascii="Arial Unicode MS" w:cs="Arial Unicode MS" w:eastAsia="Arial Unicode MS" w:hAnsi="Arial Unicode MS"/>
-          <w:b w:val="0"/>
-          <w:bCs w:val="0"/>
-          <w:i w:val="0"/>
-          <w:iCs w:val="0"/>
-          <w:smallCaps w:val="0"/>
-          <w:strike w:val="0"/>
-          <w:color w:val="333333"/>
-          <w:sz w:val="25"/>
-          <w:szCs w:val="25"/>
-          <w:u w:val="none"/>
-          <w:shd w:fill="auto" w:val="clear"/>
-          <w:vertAlign w:val="baseline"/>
-          <w:rtl w:val="0"/>
-        </w:rPr>
-        <w:t xml:space="preserve">Led Preact→React+Chakra migration, reducing bugs 30% and improving maintainability</w:t>
+          <w:rFonts w:ascii="Arial" w:cs="Arial" w:eastAsia="Arial" w:hAnsi="Arial"/>
+          <w:b w:val="0"/>
+          <w:bCs w:val="0"/>
+          <w:i w:val="0"/>
+          <w:iCs w:val="0"/>
+          <w:smallCaps w:val="0"/>
+          <w:strike w:val="0"/>
+          <w:color w:val="333333"/>
+          <w:sz w:val="25"/>
+          <w:szCs w:val="25"/>
+          <w:u w:val="none"/>
+          <w:shd w:fill="auto" w:val="clear"/>
+          <w:vertAlign w:val="baseline"/>
+          <w:rtl w:val="0"/>
+        </w:rPr>
+        <w:t xml:space="preserve">Ship features impacting 10k+ daily users; improved delivery predictability 25% via Product/UX collaboration</w:t>
+      </w:r>
+    </w:p>
+    <w:p>
+      <w:pPr>
+        <w:keepNext w:val="0"/>
+        <w:keepLines w:val="0"/>
+        <w:pageBreakBefore w:val="0"/>
+        <w:widowControl w:val="1"/>
+        <w:pBdr>
+          <w:top w:space="0" w:sz="0" w:val="nil"/>
+          <w:left w:space="0" w:sz="0" w:val="nil"/>
+          <w:bottom w:space="0" w:sz="0" w:val="nil"/>
+          <w:right w:space="0" w:sz="0" w:val="nil"/>
+          <w:between w:space="0" w:sz="0" w:val="nil"/>
+        </w:pBdr>
+        <w:shd w:fill="auto" w:val="clear"/>
+        <w:spacing w:after="10" w:before="100" w:line="240" w:lineRule="auto"/>
+        <w:ind w:left="0" w:right="0" w:firstLine="0"/>
+        <w:jc w:val="left"/>
+        <w:rPr>
+          <w:rFonts w:ascii="Arial" w:cs="Arial" w:eastAsia="Arial" w:hAnsi="Arial"/>
+          <w:b w:val="1"/>
+          <w:bCs w:val="1"/>
+          <w:i w:val="0"/>
+          <w:iCs w:val="0"/>
+          <w:smallCaps w:val="0"/>
+          <w:strike w:val="0"/>
+          <w:color w:val="1a1a1a"/>
+          <w:sz w:val="27"/>
+          <w:szCs w:val="27"/>
+          <w:u w:val="none"/>
+          <w:shd w:fill="auto" w:val="clear"/>
+          <w:vertAlign w:val="baseline"/>
+        </w:rPr>
+      </w:pPr>
+      <w:r>
+        <w:rPr>
+          <w:rFonts w:ascii="Arial" w:cs="Arial" w:eastAsia="Arial" w:hAnsi="Arial"/>
+          <w:b w:val="1"/>
+          <w:bCs w:val="1"/>
+          <w:i w:val="0"/>
+          <w:iCs w:val="0"/>
+          <w:smallCaps w:val="0"/>
+          <w:strike w:val="0"/>
+          <w:color w:val="1a1a1a"/>
+          <w:sz w:val="27"/>
+          <w:szCs w:val="27"/>
+          <w:u w:val="none"/>
+          <w:shd w:fill="auto" w:val="clear"/>
+          <w:vertAlign w:val="baseline"/>
+          <w:rtl w:val="0"/>
+        </w:rPr>
+        <w:t xml:space="preserve">Senior Frontend Engineer – Brubank</w:t>
+      </w:r>
+    </w:p>
+    <w:p>
+      <w:pPr>
+        <w:keepNext w:val="0"/>
+        <w:keepLines w:val="0"/>
+        <w:pageBreakBefore w:val="0"/>
+        <w:widowControl w:val="1"/>
+        <w:pBdr>
+          <w:top w:space="0" w:sz="0" w:val="nil"/>
+          <w:left w:space="0" w:sz="0" w:val="nil"/>
+          <w:bottom w:space="0" w:sz="0" w:val="nil"/>
+          <w:right w:space="0" w:sz="0" w:val="nil"/>
+          <w:between w:space="0" w:sz="0" w:val="nil"/>
+        </w:pBdr>
+        <w:shd w:fill="auto" w:val="clear"/>
+        <w:spacing w:after="40" w:before="0" w:line="240" w:lineRule="auto"/>
+        <w:ind w:left="0" w:right="0" w:firstLine="0"/>
+        <w:jc w:val="left"/>
+        <w:rPr>
+          <w:rFonts w:ascii="Arial" w:cs="Arial" w:eastAsia="Arial" w:hAnsi="Arial"/>
+          <w:b w:val="0"/>
+          <w:bCs w:val="0"/>
+          <w:i w:val="1"/>
+          <w:iCs w:val="1"/>
+          <w:smallCaps w:val="0"/>
+          <w:strike w:val="0"/>
+          <w:color w:val="666666"/>
+          <w:sz w:val="24"/>
+          <w:szCs w:val="24"/>
+          <w:u w:val="none"/>
+          <w:shd w:fill="auto" w:val="clear"/>
+          <w:vertAlign w:val="baseline"/>
+        </w:rPr>
+      </w:pPr>
+      <w:r>
+        <w:rPr>
+          <w:rFonts w:ascii="Arial" w:cs="Arial" w:eastAsia="Arial" w:hAnsi="Arial"/>
+          <w:b w:val="0"/>
+          <w:bCs w:val="0"/>
+          <w:i w:val="1"/>
+          <w:iCs w:val="1"/>
+          <w:smallCaps w:val="0"/>
+          <w:strike w:val="0"/>
+          <w:color w:val="666666"/>
+          <w:sz w:val="24"/>
+          <w:szCs w:val="24"/>
+          <w:u w:val="none"/>
+          <w:shd w:fill="auto" w:val="clear"/>
+          <w:vertAlign w:val="baseline"/>
+          <w:rtl w:val="0"/>
+        </w:rPr>
+        <w:t xml:space="preserve">Aug 2022 – May 2023  •  Buenos Aires</w:t>
       </w:r>
     </w:p>
     <w:p>
@@ -764,128 +826,22 @@
       </w:pPr>
       <w:r>
         <w:rPr>
-          <w:rFonts w:ascii="Arial" w:cs="Arial" w:eastAsia="Arial" w:hAnsi="Arial"/>
-          <w:b w:val="0"/>
-          <w:bCs w:val="0"/>
-          <w:i w:val="0"/>
-          <w:iCs w:val="0"/>
-          <w:smallCaps w:val="0"/>
-          <w:strike w:val="0"/>
-          <w:color w:val="333333"/>
-          <w:sz w:val="25"/>
-          <w:szCs w:val="25"/>
-          <w:u w:val="none"/>
-          <w:shd w:fill="auto" w:val="clear"/>
-          <w:vertAlign w:val="baseline"/>
-          <w:rtl w:val="0"/>
-        </w:rPr>
-        <w:t xml:space="preserve">Built business onboarding flows that cut user activation time by 20%</w:t>
-      </w:r>
-    </w:p>
-    <w:p>
-      <w:pPr>
-        <w:keepNext w:val="0"/>
-        <w:keepLines w:val="0"/>
-        <w:pageBreakBefore w:val="0"/>
-        <w:widowControl w:val="1"/>
-        <w:pBdr>
-          <w:top w:space="0" w:sz="0" w:val="nil"/>
-          <w:left w:space="0" w:sz="0" w:val="nil"/>
-          <w:bottom w:space="0" w:sz="0" w:val="nil"/>
-          <w:right w:space="0" w:sz="0" w:val="nil"/>
-          <w:between w:space="0" w:sz="0" w:val="nil"/>
-        </w:pBdr>
-        <w:shd w:fill="auto" w:val="clear"/>
-        <w:spacing w:after="10" w:before="100" w:line="240" w:lineRule="auto"/>
-        <w:ind w:left="0" w:right="0" w:firstLine="0"/>
-        <w:jc w:val="left"/>
-        <w:rPr>
-          <w:rFonts w:ascii="Arial" w:cs="Arial" w:eastAsia="Arial" w:hAnsi="Arial"/>
-          <w:b w:val="1"/>
-          <w:bCs w:val="1"/>
-          <w:i w:val="0"/>
-          <w:iCs w:val="0"/>
-          <w:smallCaps w:val="0"/>
-          <w:strike w:val="0"/>
-          <w:color w:val="1a1a1a"/>
-          <w:sz w:val="27"/>
-          <w:szCs w:val="27"/>
-          <w:u w:val="none"/>
-          <w:shd w:fill="auto" w:val="clear"/>
-          <w:vertAlign w:val="baseline"/>
-        </w:rPr>
-      </w:pPr>
-      <w:r>
-        <w:rPr>
-          <w:rFonts w:ascii="Arial" w:cs="Arial" w:eastAsia="Arial" w:hAnsi="Arial"/>
-          <w:b w:val="1"/>
-          <w:bCs w:val="1"/>
-          <w:i w:val="0"/>
-          <w:iCs w:val="0"/>
-          <w:smallCaps w:val="0"/>
-          <w:strike w:val="0"/>
-          <w:color w:val="1a1a1a"/>
-          <w:sz w:val="27"/>
-          <w:szCs w:val="27"/>
-          <w:u w:val="none"/>
-          <w:shd w:fill="auto" w:val="clear"/>
-          <w:vertAlign w:val="baseline"/>
-          <w:rtl w:val="0"/>
-        </w:rPr>
-        <w:t xml:space="preserve">Senior Frontend Engineer – Blockchain.com</w:t>
-      </w:r>
-    </w:p>
-    <w:p>
-      <w:pPr>
-        <w:keepNext w:val="0"/>
-        <w:keepLines w:val="0"/>
-        <w:pageBreakBefore w:val="0"/>
-        <w:widowControl w:val="1"/>
-        <w:pBdr>
-          <w:top w:space="0" w:sz="0" w:val="nil"/>
-          <w:left w:space="0" w:sz="0" w:val="nil"/>
-          <w:bottom w:space="0" w:sz="0" w:val="nil"/>
-          <w:right w:space="0" w:sz="0" w:val="nil"/>
-          <w:between w:space="0" w:sz="0" w:val="nil"/>
-        </w:pBdr>
-        <w:shd w:fill="auto" w:val="clear"/>
-        <w:spacing w:after="40" w:before="0" w:line="240" w:lineRule="auto"/>
-        <w:ind w:left="0" w:right="0" w:firstLine="0"/>
-        <w:jc w:val="left"/>
-        <w:rPr>
-          <w:rFonts w:ascii="Arial" w:cs="Arial" w:eastAsia="Arial" w:hAnsi="Arial"/>
-          <w:b w:val="0"/>
-          <w:bCs w:val="0"/>
-          <w:i w:val="1"/>
-          <w:iCs w:val="1"/>
-          <w:smallCaps w:val="0"/>
-          <w:strike w:val="0"/>
-          <w:color w:val="666666"/>
-          <w:sz w:val="24"/>
-          <w:szCs w:val="24"/>
-          <w:u w:val="none"/>
-          <w:shd w:fill="auto" w:val="clear"/>
-          <w:vertAlign w:val="baseline"/>
-        </w:rPr>
-      </w:pPr>
-      <w:r>
-        <w:rPr>
-          <w:rFonts w:ascii="Arial" w:cs="Arial" w:eastAsia="Arial" w:hAnsi="Arial"/>
-          <w:b w:val="0"/>
-          <w:bCs w:val="0"/>
-          <w:i w:val="1"/>
-          <w:iCs w:val="1"/>
-          <w:smallCaps w:val="0"/>
-          <w:strike w:val="0"/>
-          <w:color w:val="666666"/>
-          <w:sz w:val="24"/>
-          <w:szCs w:val="24"/>
-          <w:u w:val="none"/>
-          <w:shd w:fill="auto" w:val="clear"/>
-          <w:vertAlign w:val="baseline"/>
-          <w:rtl w:val="0"/>
-        </w:rPr>
-        <w:t xml:space="preserve">Jan 2022 – Jul 2022  •  Remote</w:t>
+          <w:rFonts w:ascii="Arial Unicode MS" w:cs="Arial Unicode MS" w:eastAsia="Arial Unicode MS" w:hAnsi="Arial Unicode MS"/>
+          <w:b w:val="0"/>
+          <w:bCs w:val="0"/>
+          <w:i w:val="0"/>
+          <w:iCs w:val="0"/>
+          <w:smallCaps w:val="0"/>
+          <w:strike w:val="0"/>
+          <w:color w:val="333333"/>
+          <w:sz w:val="25"/>
+          <w:szCs w:val="25"/>
+          <w:u w:val="none"/>
+          <w:shd w:fill="auto" w:val="clear"/>
+          <w:vertAlign w:val="baseline"/>
+          <w:rtl w:val="0"/>
+        </w:rPr>
+        <w:t xml:space="preserve">Led Preact→React+Chakra migration, reducing bugs 30% and improving maintainability</w:t>
       </w:r>
     </w:p>
     <w:p>
@@ -931,7 +887,110 @@
           <w:vertAlign w:val="baseline"/>
           <w:rtl w:val="0"/>
         </w:rPr>
-        <w:t xml:space="preserve">Developed staking/rewards features in React+TypeScript for 1M+ wallet users</w:t>
+        <w:t xml:space="preserve">Built business onboarding flows that cut user activation time by 20%</w:t>
+      </w:r>
+    </w:p>
+    <w:p>
+      <w:pPr>
+        <w:keepNext w:val="0"/>
+        <w:keepLines w:val="0"/>
+        <w:pageBreakBefore w:val="0"/>
+        <w:widowControl w:val="1"/>
+        <w:pBdr>
+          <w:top w:space="0" w:sz="0" w:val="nil"/>
+          <w:left w:space="0" w:sz="0" w:val="nil"/>
+          <w:bottom w:space="0" w:sz="0" w:val="nil"/>
+          <w:right w:space="0" w:sz="0" w:val="nil"/>
+          <w:between w:space="0" w:sz="0" w:val="nil"/>
+        </w:pBdr>
+        <w:shd w:fill="auto" w:val="clear"/>
+        <w:spacing w:after="10" w:before="100" w:line="240" w:lineRule="auto"/>
+        <w:ind w:left="0" w:right="0" w:firstLine="0"/>
+        <w:jc w:val="left"/>
+        <w:rPr>
+          <w:rFonts w:ascii="Arial" w:cs="Arial" w:eastAsia="Arial" w:hAnsi="Arial"/>
+          <w:b w:val="1"/>
+          <w:bCs w:val="1"/>
+          <w:i w:val="0"/>
+          <w:iCs w:val="0"/>
+          <w:smallCaps w:val="0"/>
+          <w:strike w:val="0"/>
+          <w:color w:val="1a1a1a"/>
+          <w:sz w:val="27"/>
+          <w:szCs w:val="27"/>
+          <w:u w:val="none"/>
+          <w:shd w:fill="auto" w:val="clear"/>
+          <w:vertAlign w:val="baseline"/>
+        </w:rPr>
+      </w:pPr>
+      <w:r>
+        <w:rPr>
+          <w:b w:val="1"/>
+          <w:bCs w:val="1"/>
+          <w:color w:val="1a1a1a"/>
+          <w:sz w:val="27"/>
+          <w:szCs w:val="27"/>
+          <w:rtl w:val="0"/>
+        </w:rPr>
+        <w:t xml:space="preserve">Senior Frontend Engineer II – Blockchain.com</w:t>
+      </w:r>
+      <w:r>
+        <w:rPr>
+          <w:rtl w:val="0"/>
+        </w:rPr>
+      </w:r>
+    </w:p>
+    <w:p>
+      <w:pPr>
+        <w:keepNext w:val="0"/>
+        <w:keepLines w:val="0"/>
+        <w:pageBreakBefore w:val="0"/>
+        <w:widowControl w:val="1"/>
+        <w:pBdr>
+          <w:top w:space="0" w:sz="0" w:val="nil"/>
+          <w:left w:space="0" w:sz="0" w:val="nil"/>
+          <w:bottom w:space="0" w:sz="0" w:val="nil"/>
+          <w:right w:space="0" w:sz="0" w:val="nil"/>
+          <w:between w:space="0" w:sz="0" w:val="nil"/>
+        </w:pBdr>
+        <w:shd w:fill="auto" w:val="clear"/>
+        <w:spacing w:after="40" w:before="0" w:line="240" w:lineRule="auto"/>
+        <w:ind w:left="0" w:right="0" w:firstLine="0"/>
+        <w:jc w:val="left"/>
+        <w:rPr>
+          <w:rFonts w:ascii="Arial" w:cs="Arial" w:eastAsia="Arial" w:hAnsi="Arial"/>
+          <w:b w:val="0"/>
+          <w:bCs w:val="0"/>
+          <w:i w:val="1"/>
+          <w:iCs w:val="1"/>
+          <w:smallCaps w:val="0"/>
+          <w:strike w:val="0"/>
+          <w:color w:val="666666"/>
+          <w:sz w:val="24"/>
+          <w:szCs w:val="24"/>
+          <w:u w:val="none"/>
+          <w:shd w:fill="auto" w:val="clear"/>
+          <w:vertAlign w:val="baseline"/>
+        </w:rPr>
+      </w:pPr>
+      <w:r>
+        <w:rPr>
+          <w:rFonts w:ascii="Arial" w:cs="Arial" w:eastAsia="Arial" w:hAnsi="Arial"/>
+          <w:b w:val="0"/>
+          <w:bCs w:val="0"/>
+          <w:i w:val="1"/>
+          <w:iCs w:val="1"/>
+          <w:smallCaps w:val="0"/>
+          <w:strike w:val="0"/>
+          <w:color w:val="666666"/>
+          <w:sz w:val="24"/>
+          <w:szCs w:val="24"/>
+          <w:u w:val="none"/>
+          <w:shd w:fill="auto" w:val="clear"/>
+          <w:vertAlign w:val="baseline"/>
+          <w:rtl w:val="0"/>
+        </w:rPr>
+        <w:t xml:space="preserve">Jan 2022 – Jul 2022  •  Remote</w:t>
       </w:r>
     </w:p>
     <w:p>
@@ -977,113 +1036,7 @@
           <w:vertAlign w:val="baseline"/>
           <w:rtl w:val="0"/>
         </w:rPr>
-        <w:t xml:space="preserve">Optimized Redux-Saga flows, reducing dashboard latency by 35%</w:t>
-      </w:r>
-    </w:p>
-    <w:p>
-      <w:pPr>
-        <w:keepNext w:val="0"/>
-        <w:keepLines w:val="0"/>
-        <w:pageBreakBefore w:val="0"/>
-        <w:widowControl w:val="1"/>
-        <w:pBdr>
-          <w:top w:space="0" w:sz="0" w:val="nil"/>
-          <w:left w:space="0" w:sz="0" w:val="nil"/>
-          <w:bottom w:space="0" w:sz="0" w:val="nil"/>
-          <w:right w:space="0" w:sz="0" w:val="nil"/>
-          <w:between w:space="0" w:sz="0" w:val="nil"/>
-        </w:pBdr>
-        <w:shd w:fill="auto" w:val="clear"/>
-        <w:spacing w:after="10" w:before="100" w:line="240" w:lineRule="auto"/>
-        <w:ind w:left="0" w:right="0" w:firstLine="0"/>
-        <w:jc w:val="left"/>
-        <w:rPr>
-          <w:rFonts w:ascii="Arial" w:cs="Arial" w:eastAsia="Arial" w:hAnsi="Arial"/>
-          <w:b w:val="1"/>
-          <w:bCs w:val="1"/>
-          <w:i w:val="0"/>
-          <w:iCs w:val="0"/>
-          <w:smallCaps w:val="0"/>
-          <w:strike w:val="0"/>
-          <w:color w:val="1a1a1a"/>
-          <w:sz w:val="27"/>
-          <w:szCs w:val="27"/>
-          <w:u w:val="none"/>
-          <w:shd w:fill="auto" w:val="clear"/>
-          <w:vertAlign w:val="baseline"/>
-        </w:rPr>
-      </w:pPr>
-      <w:r>
-        <w:rPr>
-          <w:rFonts w:ascii="Arial" w:cs="Arial" w:eastAsia="Arial" w:hAnsi="Arial"/>
-          <w:b w:val="1"/>
-          <w:bCs w:val="1"/>
-          <w:i w:val="0"/>
-          <w:iCs w:val="0"/>
-          <w:smallCaps w:val="0"/>
-          <w:strike w:val="0"/>
-          <w:color w:val="1a1a1a"/>
-          <w:sz w:val="27"/>
-          <w:szCs w:val="27"/>
-          <w:u w:val="none"/>
-          <w:shd w:fill="auto" w:val="clear"/>
-          <w:vertAlign w:val="baseline"/>
-          <w:rtl w:val="0"/>
-        </w:rPr>
-        <w:t xml:space="preserve">Senior Frontend Engineer – Elementum SCM</w:t>
-      </w:r>
-    </w:p>
-    <w:p>
-      <w:pPr>
-        <w:keepNext w:val="0"/>
-        <w:keepLines w:val="0"/>
-        <w:pageBreakBefore w:val="0"/>
-        <w:widowControl w:val="1"/>
-        <w:pBdr>
-          <w:top w:space="0" w:sz="0" w:val="nil"/>
-          <w:left w:space="0" w:sz="0" w:val="nil"/>
-          <w:bottom w:space="0" w:sz="0" w:val="nil"/>
-          <w:right w:space="0" w:sz="0" w:val="nil"/>
-          <w:between w:space="0" w:sz="0" w:val="nil"/>
-        </w:pBdr>
-        <w:shd w:fill="auto" w:val="clear"/>
-        <w:spacing w:after="40" w:before="0" w:line="240" w:lineRule="auto"/>
-        <w:ind w:left="0" w:right="0" w:firstLine="0"/>
-        <w:jc w:val="left"/>
-        <w:rPr>
-          <w:rFonts w:ascii="Arial" w:cs="Arial" w:eastAsia="Arial" w:hAnsi="Arial"/>
-          <w:b w:val="0"/>
-          <w:bCs w:val="0"/>
-          <w:i w:val="1"/>
-          <w:iCs w:val="1"/>
-          <w:smallCaps w:val="0"/>
-          <w:strike w:val="0"/>
-          <w:color w:val="666666"/>
-          <w:sz w:val="24"/>
-          <w:szCs w:val="24"/>
-          <w:u w:val="none"/>
-          <w:shd w:fill="auto" w:val="clear"/>
-          <w:vertAlign w:val="baseline"/>
-        </w:rPr>
-      </w:pPr>
-      <w:r>
-        <w:rPr>
-          <w:rFonts w:ascii="Arial" w:cs="Arial" w:eastAsia="Arial" w:hAnsi="Arial"/>
-          <w:b w:val="0"/>
-          <w:bCs w:val="0"/>
-          <w:i w:val="1"/>
-          <w:iCs w:val="1"/>
-          <w:smallCaps w:val="0"/>
-          <w:strike w:val="0"/>
-          <w:color w:val="666666"/>
-          <w:sz w:val="24"/>
-          <w:szCs w:val="24"/>
-          <w:u w:val="none"/>
-          <w:shd w:fill="auto" w:val="clear"/>
-          <w:vertAlign w:val="baseline"/>
-          <w:rtl w:val="0"/>
-        </w:rPr>
-        <w:t xml:space="preserve">Aug 2017 – Jan 2022  •  Remote</w:t>
+        <w:t xml:space="preserve">Developed staking/rewards features in React+TypeScript for 1M+ wallet users</w:t>
       </w:r>
     </w:p>
     <w:p>
@@ -1129,7 +1082,110 @@
           <w:vertAlign w:val="baseline"/>
           <w:rtl w:val="0"/>
         </w:rPr>
-        <w:t xml:space="preserve">Built warehouse dashboard for Starbucks, Philips, Barilla; created IAM for 100+ users</w:t>
+        <w:t xml:space="preserve">Optimized Redux-Saga flows, reducing dashboard latency by 35%</w:t>
+      </w:r>
+    </w:p>
+    <w:p>
+      <w:pPr>
+        <w:keepNext w:val="0"/>
+        <w:keepLines w:val="0"/>
+        <w:pageBreakBefore w:val="0"/>
+        <w:widowControl w:val="1"/>
+        <w:pBdr>
+          <w:top w:space="0" w:sz="0" w:val="nil"/>
+          <w:left w:space="0" w:sz="0" w:val="nil"/>
+          <w:bottom w:space="0" w:sz="0" w:val="nil"/>
+          <w:right w:space="0" w:sz="0" w:val="nil"/>
+          <w:between w:space="0" w:sz="0" w:val="nil"/>
+        </w:pBdr>
+        <w:shd w:fill="auto" w:val="clear"/>
+        <w:spacing w:after="10" w:before="100" w:line="240" w:lineRule="auto"/>
+        <w:ind w:left="0" w:right="0" w:firstLine="0"/>
+        <w:jc w:val="left"/>
+        <w:rPr>
+          <w:rFonts w:ascii="Arial" w:cs="Arial" w:eastAsia="Arial" w:hAnsi="Arial"/>
+          <w:b w:val="1"/>
+          <w:bCs w:val="1"/>
+          <w:i w:val="0"/>
+          <w:iCs w:val="0"/>
+          <w:smallCaps w:val="0"/>
+          <w:strike w:val="0"/>
+          <w:color w:val="1a1a1a"/>
+          <w:sz w:val="27"/>
+          <w:szCs w:val="27"/>
+          <w:u w:val="none"/>
+          <w:shd w:fill="auto" w:val="clear"/>
+          <w:vertAlign w:val="baseline"/>
+        </w:rPr>
+      </w:pPr>
+      <w:r>
+        <w:rPr>
+          <w:b w:val="1"/>
+          <w:bCs w:val="1"/>
+          <w:color w:val="1a1a1a"/>
+          <w:sz w:val="27"/>
+          <w:szCs w:val="27"/>
+          <w:rtl w:val="0"/>
+        </w:rPr>
+        <w:t xml:space="preserve">Senior Frontend Engineer II – Elementum SCM</w:t>
+      </w:r>
+      <w:r>
+        <w:rPr>
+          <w:rtl w:val="0"/>
+        </w:rPr>
+      </w:r>
+    </w:p>
+    <w:p>
+      <w:pPr>
+        <w:keepNext w:val="0"/>
+        <w:keepLines w:val="0"/>
+        <w:pageBreakBefore w:val="0"/>
+        <w:widowControl w:val="1"/>
+        <w:pBdr>
+          <w:top w:space="0" w:sz="0" w:val="nil"/>
+          <w:left w:space="0" w:sz="0" w:val="nil"/>
+          <w:bottom w:space="0" w:sz="0" w:val="nil"/>
+          <w:right w:space="0" w:sz="0" w:val="nil"/>
+          <w:between w:space="0" w:sz="0" w:val="nil"/>
+        </w:pBdr>
+        <w:shd w:fill="auto" w:val="clear"/>
+        <w:spacing w:after="40" w:before="0" w:line="240" w:lineRule="auto"/>
+        <w:ind w:left="0" w:right="0" w:firstLine="0"/>
+        <w:jc w:val="left"/>
+        <w:rPr>
+          <w:rFonts w:ascii="Arial" w:cs="Arial" w:eastAsia="Arial" w:hAnsi="Arial"/>
+          <w:b w:val="0"/>
+          <w:bCs w:val="0"/>
+          <w:i w:val="1"/>
+          <w:iCs w:val="1"/>
+          <w:smallCaps w:val="0"/>
+          <w:strike w:val="0"/>
+          <w:color w:val="666666"/>
+          <w:sz w:val="24"/>
+          <w:szCs w:val="24"/>
+          <w:u w:val="none"/>
+          <w:shd w:fill="auto" w:val="clear"/>
+          <w:vertAlign w:val="baseline"/>
+        </w:rPr>
+      </w:pPr>
+      <w:r>
+        <w:rPr>
+          <w:rFonts w:ascii="Arial" w:cs="Arial" w:eastAsia="Arial" w:hAnsi="Arial"/>
+          <w:b w:val="0"/>
+          <w:bCs w:val="0"/>
+          <w:i w:val="1"/>
+          <w:iCs w:val="1"/>
+          <w:smallCaps w:val="0"/>
+          <w:strike w:val="0"/>
+          <w:color w:val="666666"/>
+          <w:sz w:val="24"/>
+          <w:szCs w:val="24"/>
+          <w:u w:val="none"/>
+          <w:shd w:fill="auto" w:val="clear"/>
+          <w:vertAlign w:val="baseline"/>
+          <w:rtl w:val="0"/>
+        </w:rPr>
+        <w:t xml:space="preserve">Aug 2017 – Jan 2022  •  Remote</w:t>
       </w:r>
     </w:p>
     <w:p>
@@ -1175,113 +1231,7 @@
           <w:vertAlign w:val="baseline"/>
           <w:rtl w:val="0"/>
         </w:rPr>
-        <w:t xml:space="preserve">Architected shared component library with Webpack Module Federation, cutting code duplication 50%</w:t>
-      </w:r>
-    </w:p>
-    <w:p>
-      <w:pPr>
-        <w:keepNext w:val="0"/>
-        <w:keepLines w:val="0"/>
-        <w:pageBreakBefore w:val="0"/>
-        <w:widowControl w:val="1"/>
-        <w:pBdr>
-          <w:top w:space="0" w:sz="0" w:val="nil"/>
-          <w:left w:space="0" w:sz="0" w:val="nil"/>
-          <w:bottom w:space="0" w:sz="0" w:val="nil"/>
-          <w:right w:space="0" w:sz="0" w:val="nil"/>
-          <w:between w:space="0" w:sz="0" w:val="nil"/>
-        </w:pBdr>
-        <w:shd w:fill="auto" w:val="clear"/>
-        <w:spacing w:after="10" w:before="100" w:line="240" w:lineRule="auto"/>
-        <w:ind w:left="0" w:right="0" w:firstLine="0"/>
-        <w:jc w:val="left"/>
-        <w:rPr>
-          <w:rFonts w:ascii="Arial" w:cs="Arial" w:eastAsia="Arial" w:hAnsi="Arial"/>
-          <w:b w:val="1"/>
-          <w:bCs w:val="1"/>
-          <w:i w:val="0"/>
-          <w:iCs w:val="0"/>
-          <w:smallCaps w:val="0"/>
-          <w:strike w:val="0"/>
-          <w:color w:val="1a1a1a"/>
-          <w:sz w:val="27"/>
-          <w:szCs w:val="27"/>
-          <w:u w:val="none"/>
-          <w:shd w:fill="auto" w:val="clear"/>
-          <w:vertAlign w:val="baseline"/>
-        </w:rPr>
-      </w:pPr>
-      <w:r>
-        <w:rPr>
-          <w:rFonts w:ascii="Arial" w:cs="Arial" w:eastAsia="Arial" w:hAnsi="Arial"/>
-          <w:b w:val="1"/>
-          <w:bCs w:val="1"/>
-          <w:i w:val="0"/>
-          <w:iCs w:val="0"/>
-          <w:smallCaps w:val="0"/>
-          <w:strike w:val="0"/>
-          <w:color w:val="1a1a1a"/>
-          <w:sz w:val="27"/>
-          <w:szCs w:val="27"/>
-          <w:u w:val="none"/>
-          <w:shd w:fill="auto" w:val="clear"/>
-          <w:vertAlign w:val="baseline"/>
-          <w:rtl w:val="0"/>
-        </w:rPr>
-        <w:t xml:space="preserve">Frontend Engineer – Globant</w:t>
-      </w:r>
-    </w:p>
-    <w:p>
-      <w:pPr>
-        <w:keepNext w:val="0"/>
-        <w:keepLines w:val="0"/>
-        <w:pageBreakBefore w:val="0"/>
-        <w:widowControl w:val="1"/>
-        <w:pBdr>
-          <w:top w:space="0" w:sz="0" w:val="nil"/>
-          <w:left w:space="0" w:sz="0" w:val="nil"/>
-          <w:bottom w:space="0" w:sz="0" w:val="nil"/>
-          <w:right w:space="0" w:sz="0" w:val="nil"/>
-          <w:between w:space="0" w:sz="0" w:val="nil"/>
-        </w:pBdr>
-        <w:shd w:fill="auto" w:val="clear"/>
-        <w:spacing w:after="40" w:before="0" w:line="240" w:lineRule="auto"/>
-        <w:ind w:left="0" w:right="0" w:firstLine="0"/>
-        <w:jc w:val="left"/>
-        <w:rPr>
-          <w:rFonts w:ascii="Arial" w:cs="Arial" w:eastAsia="Arial" w:hAnsi="Arial"/>
-          <w:b w:val="0"/>
-          <w:bCs w:val="0"/>
-          <w:i w:val="1"/>
-          <w:iCs w:val="1"/>
-          <w:smallCaps w:val="0"/>
-          <w:strike w:val="0"/>
-          <w:color w:val="666666"/>
-          <w:sz w:val="24"/>
-          <w:szCs w:val="24"/>
-          <w:u w:val="none"/>
-          <w:shd w:fill="auto" w:val="clear"/>
-          <w:vertAlign w:val="baseline"/>
-        </w:rPr>
-      </w:pPr>
-      <w:r>
-        <w:rPr>
-          <w:rFonts w:ascii="Arial" w:cs="Arial" w:eastAsia="Arial" w:hAnsi="Arial"/>
-          <w:b w:val="0"/>
-          <w:bCs w:val="0"/>
-          <w:i w:val="1"/>
-          <w:iCs w:val="1"/>
-          <w:smallCaps w:val="0"/>
-          <w:strike w:val="0"/>
-          <w:color w:val="666666"/>
-          <w:sz w:val="24"/>
-          <w:szCs w:val="24"/>
-          <w:u w:val="none"/>
-          <w:shd w:fill="auto" w:val="clear"/>
-          <w:vertAlign w:val="baseline"/>
-          <w:rtl w:val="0"/>
-        </w:rPr>
-        <w:t xml:space="preserve">Aug 2010 – Sep 2017  •  Buenos Aires</w:t>
+        <w:t xml:space="preserve">Built warehouse dashboard for Starbucks, Philips, Barilla; created IAM for 100+ users</w:t>
       </w:r>
     </w:p>
     <w:p>
@@ -1327,7 +1277,110 @@
           <w:vertAlign w:val="baseline"/>
           <w:rtl w:val="0"/>
         </w:rPr>
-        <w:t xml:space="preserve">Built Disney Cruise Line &amp; FastPass+ platforms with full responsive support</w:t>
+        <w:t xml:space="preserve">Architected shared component library with Webpack Module Federation, cutting code duplication 50%</w:t>
+      </w:r>
+    </w:p>
+    <w:p>
+      <w:pPr>
+        <w:keepNext w:val="0"/>
+        <w:keepLines w:val="0"/>
+        <w:pageBreakBefore w:val="0"/>
+        <w:widowControl w:val="1"/>
+        <w:pBdr>
+          <w:top w:space="0" w:sz="0" w:val="nil"/>
+          <w:left w:space="0" w:sz="0" w:val="nil"/>
+          <w:bottom w:space="0" w:sz="0" w:val="nil"/>
+          <w:right w:space="0" w:sz="0" w:val="nil"/>
+          <w:between w:space="0" w:sz="0" w:val="nil"/>
+        </w:pBdr>
+        <w:shd w:fill="auto" w:val="clear"/>
+        <w:spacing w:after="10" w:before="100" w:line="240" w:lineRule="auto"/>
+        <w:ind w:left="0" w:right="0" w:firstLine="0"/>
+        <w:jc w:val="left"/>
+        <w:rPr>
+          <w:rFonts w:ascii="Arial" w:cs="Arial" w:eastAsia="Arial" w:hAnsi="Arial"/>
+          <w:b w:val="1"/>
+          <w:bCs w:val="1"/>
+          <w:i w:val="0"/>
+          <w:iCs w:val="0"/>
+          <w:smallCaps w:val="0"/>
+          <w:strike w:val="0"/>
+          <w:color w:val="1a1a1a"/>
+          <w:sz w:val="27"/>
+          <w:szCs w:val="27"/>
+          <w:u w:val="none"/>
+          <w:shd w:fill="auto" w:val="clear"/>
+          <w:vertAlign w:val="baseline"/>
+        </w:rPr>
+      </w:pPr>
+      <w:r>
+        <w:rPr>
+          <w:b w:val="1"/>
+          <w:bCs w:val="1"/>
+          <w:color w:val="1a1a1a"/>
+          <w:sz w:val="27"/>
+          <w:szCs w:val="27"/>
+          <w:rtl w:val="0"/>
+        </w:rPr>
+        <w:t xml:space="preserve">Senior Frontend Engineer – Globant</w:t>
+      </w:r>
+      <w:r>
+        <w:rPr>
+          <w:rtl w:val="0"/>
+        </w:rPr>
+      </w:r>
+    </w:p>
+    <w:p>
+      <w:pPr>
+        <w:keepNext w:val="0"/>
+        <w:keepLines w:val="0"/>
+        <w:pageBreakBefore w:val="0"/>
+        <w:widowControl w:val="1"/>
+        <w:pBdr>
+          <w:top w:space="0" w:sz="0" w:val="nil"/>
+          <w:left w:space="0" w:sz="0" w:val="nil"/>
+          <w:bottom w:space="0" w:sz="0" w:val="nil"/>
+          <w:right w:space="0" w:sz="0" w:val="nil"/>
+          <w:between w:space="0" w:sz="0" w:val="nil"/>
+        </w:pBdr>
+        <w:shd w:fill="auto" w:val="clear"/>
+        <w:spacing w:after="40" w:before="0" w:line="240" w:lineRule="auto"/>
+        <w:ind w:left="0" w:right="0" w:firstLine="0"/>
+        <w:jc w:val="left"/>
+        <w:rPr>
+          <w:rFonts w:ascii="Arial" w:cs="Arial" w:eastAsia="Arial" w:hAnsi="Arial"/>
+          <w:b w:val="0"/>
+          <w:bCs w:val="0"/>
+          <w:i w:val="1"/>
+          <w:iCs w:val="1"/>
+          <w:smallCaps w:val="0"/>
+          <w:strike w:val="0"/>
+          <w:color w:val="666666"/>
+          <w:sz w:val="24"/>
+          <w:szCs w:val="24"/>
+          <w:u w:val="none"/>
+          <w:shd w:fill="auto" w:val="clear"/>
+          <w:vertAlign w:val="baseline"/>
+        </w:rPr>
+      </w:pPr>
+      <w:r>
+        <w:rPr>
+          <w:rFonts w:ascii="Arial" w:cs="Arial" w:eastAsia="Arial" w:hAnsi="Arial"/>
+          <w:b w:val="0"/>
+          <w:bCs w:val="0"/>
+          <w:i w:val="1"/>
+          <w:iCs w:val="1"/>
+          <w:smallCaps w:val="0"/>
+          <w:strike w:val="0"/>
+          <w:color w:val="666666"/>
+          <w:sz w:val="24"/>
+          <w:szCs w:val="24"/>
+          <w:u w:val="none"/>
+          <w:shd w:fill="auto" w:val="clear"/>
+          <w:vertAlign w:val="baseline"/>
+          <w:rtl w:val="0"/>
+        </w:rPr>
+        <w:t xml:space="preserve">Aug 2010 – Sep 2017  •  Buenos Aires</w:t>
       </w:r>
     </w:p>
     <w:p>
@@ -1373,6 +1426,52 @@
           <w:vertAlign w:val="baseline"/>
           <w:rtl w:val="0"/>
         </w:rPr>
+        <w:t xml:space="preserve">Built Disney Cruise Line &amp; FastPass+ platforms with full responsive support</w:t>
+      </w:r>
+    </w:p>
+    <w:p>
+      <w:pPr>
+        <w:keepNext w:val="0"/>
+        <w:keepLines w:val="0"/>
+        <w:pageBreakBefore w:val="0"/>
+        <w:widowControl w:val="1"/>
+        <w:numPr>
+          <w:ilvl w:val="0"/>
+          <w:numId w:val="1"/>
+        </w:numPr>
+        <w:pBdr>
+          <w:top w:space="0" w:sz="0" w:val="nil"/>
+          <w:left w:space="0" w:sz="0" w:val="nil"/>
+          <w:bottom w:space="0" w:sz="0" w:val="nil"/>
+          <w:right w:space="0" w:sz="0" w:val="nil"/>
+          <w:between w:space="0" w:sz="0" w:val="nil"/>
+        </w:pBdr>
+        <w:shd w:fill="auto" w:val="clear"/>
+        <w:spacing w:after="20" w:before="0" w:line="276" w:lineRule="auto"/>
+        <w:ind w:left="540" w:right="0" w:hanging="270"/>
+        <w:jc w:val="left"/>
+        <w:rPr>
+          <w:sz w:val="26"/>
+          <w:szCs w:val="26"/>
+        </w:rPr>
+      </w:pPr>
+      <w:r>
+        <w:rPr>
+          <w:rFonts w:ascii="Arial" w:cs="Arial" w:eastAsia="Arial" w:hAnsi="Arial"/>
+          <w:b w:val="0"/>
+          <w:bCs w:val="0"/>
+          <w:i w:val="0"/>
+          <w:iCs w:val="0"/>
+          <w:smallCaps w:val="0"/>
+          <w:strike w:val="0"/>
+          <w:color w:val="333333"/>
+          <w:sz w:val="25"/>
+          <w:szCs w:val="25"/>
+          <w:u w:val="none"/>
+          <w:shd w:fill="auto" w:val="clear"/>
+          <w:vertAlign w:val="baseline"/>
+          <w:rtl w:val="0"/>
+        </w:rPr>
         <w:t xml:space="preserve">Delivered Deloitte internal tools in AngularJS with 90% test coverage</w:t>
       </w:r>
     </w:p>
@@ -1427,6 +1526,50 @@
           <w:rtl w:val="0"/>
         </w:rPr>
         <w:t xml:space="preserve">Skills</w:t>
+      </w:r>
+    </w:p>
+    <w:p>
+      <w:pPr>
+        <w:keepNext w:val="0"/>
+        <w:keepLines w:val="0"/>
+        <w:pageBreakBefore w:val="0"/>
+        <w:widowControl w:val="1"/>
+        <w:pBdr>
+          <w:top w:space="0" w:sz="0" w:val="nil"/>
+          <w:left w:space="0" w:sz="0" w:val="nil"/>
+          <w:bottom w:space="0" w:sz="0" w:val="nil"/>
+          <w:right w:space="0" w:sz="0" w:val="nil"/>
+          <w:between w:space="0" w:sz="0" w:val="nil"/>
+        </w:pBdr>
+        <w:shd w:fill="auto" w:val="clear"/>
+        <w:spacing w:after="20" w:before="30" w:line="276" w:lineRule="auto"/>
+        <w:ind w:left="0" w:right="0" w:firstLine="0"/>
+        <w:jc w:val="left"/>
+        <w:rPr>
+          <w:color w:val="333333"/>
+          <w:sz w:val="25"/>
+          <w:szCs w:val="25"/>
+        </w:rPr>
+      </w:pPr>
+      <w:r>
+        <w:rPr>
+          <w:b w:val="1"/>
+          <w:bCs w:val="1"/>
+          <w:color w:val="333333"/>
+          <w:sz w:val="25"/>
+          <w:szCs w:val="25"/>
+          <w:rtl w:val="0"/>
+        </w:rPr>
+        <w:t xml:space="preserve">AI: </w:t>
+      </w:r>
+      <w:r>
+        <w:rPr>
+          <w:color w:val="333333"/>
+          <w:sz w:val="25"/>
+          <w:szCs w:val="25"/>
+          <w:rtl w:val="0"/>
+        </w:rPr>
+        <w:t xml:space="preserve">LLM integration, AI agents (Claude Code skills &amp; agents), prompt engineering</w:t>
       </w:r>
     </w:p>
     <w:p>

</xml_diff>